<commit_message>
Appendix: add reference list for all works cited in the reply letter
15 entries in letter order with clickable DOI links, extracted programmatically
from the verified chapter-3 reference list (no hand transcription). Letter
points to it; pandoc pipeline and existing formatting conventions unchanged.

Co-Authored-By: Claude Fable 5 <noreply@anthropic.com>
</commit_message>
<xml_diff>
--- a/notes/appendix_si2024_comparison.docx
+++ b/notes/appendix_si2024_comparison.docx
@@ -2,7 +2,7 @@
 <file path=word/document.xml><?xml version="1.0" encoding="utf-8"?>
 <w:document xmlns:w="http://schemas.openxmlformats.org/wordprocessingml/2006/main" xmlns:m="http://schemas.openxmlformats.org/officeDocument/2006/math" xmlns:r="http://schemas.openxmlformats.org/officeDocument/2006/relationships" xmlns:o="urn:schemas-microsoft-com:office:office" xmlns:v="urn:schemas-microsoft-com:vml" xmlns:w10="urn:schemas-microsoft-com:office:word" xmlns:a="http://schemas.openxmlformats.org/drawingml/2006/main" xmlns:pic="http://schemas.openxmlformats.org/drawingml/2006/picture" xmlns:wp="http://schemas.openxmlformats.org/drawingml/2006/wordprocessingDrawing">
   <w:body>
-    <w:bookmarkStart w:id="17" w:name="附录本文与si等-2024-工作的逐项对比"/>
+    <w:bookmarkStart w:id="33" w:name="附录本文与si等-2024-工作的逐项对比"/>
     <w:p>
       <w:pPr>
         <w:pStyle w:val="Heading1"/>
@@ -2104,7 +2104,421 @@
       </w:tr>
     </w:tbl>
     <w:bookmarkEnd w:id="16"/>
-    <w:bookmarkEnd w:id="17"/>
+    <w:bookmarkStart w:id="32" w:name="信中所引文献"/>
+    <w:p>
+      <w:pPr>
+        <w:pStyle w:val="Heading2"/>
+      </w:pPr>
+      <w:r>
+        <w:rPr>
+          <w:rFonts w:hint="eastAsia"/>
+        </w:rPr>
+        <w:t xml:space="preserve">信中所引文献</w:t>
+      </w:r>
+    </w:p>
+    <w:p>
+      <w:pPr>
+        <w:pStyle w:val="FirstParagraph"/>
+      </w:pPr>
+      <w:r>
+        <w:rPr>
+          <w:rFonts w:hint="eastAsia"/>
+        </w:rPr>
+        <w:t xml:space="preserve">以下为说明信中提及的全部文献，按信中出现顺序，DOI为可点击链接。</w:t>
+      </w:r>
+    </w:p>
+    <w:p>
+      <w:pPr>
+        <w:pStyle w:val="Compact"/>
+        <w:numPr>
+          <w:ilvl w:val="0"/>
+          <w:numId w:val="1001"/>
+        </w:numPr>
+      </w:pPr>
+      <w:r>
+        <w:t xml:space="preserve">Metropolis N, Rosenbluth A W, Rosenbluth M N, et al. Equation of state calculations by fast computing machines[J]. The Journal of Chemical Physics, 1953, 21(6): 1087-1092. DOI:</w:t>
+      </w:r>
+      <w:r>
+        <w:t xml:space="preserve"> </w:t>
+      </w:r>
+      <w:hyperlink r:id="rId17">
+        <w:r>
+          <w:rPr>
+            <w:rStyle w:val="Hyperlink"/>
+          </w:rPr>
+          <w:t xml:space="preserve">10.1063/1.1699114</w:t>
+        </w:r>
+      </w:hyperlink>
+      <w:r>
+        <w:t xml:space="preserve">.</w:t>
+      </w:r>
+    </w:p>
+    <w:p>
+      <w:pPr>
+        <w:pStyle w:val="Compact"/>
+        <w:numPr>
+          <w:ilvl w:val="0"/>
+          <w:numId w:val="1001"/>
+        </w:numPr>
+      </w:pPr>
+      <w:r>
+        <w:t xml:space="preserve">Glauber R J. Time-dependent statistics of the Ising model[J]. Journal of Mathematical Physics, 1963, 4(2): 294-307. DOI:</w:t>
+      </w:r>
+      <w:r>
+        <w:t xml:space="preserve"> </w:t>
+      </w:r>
+      <w:hyperlink r:id="rId18">
+        <w:r>
+          <w:rPr>
+            <w:rStyle w:val="Hyperlink"/>
+          </w:rPr>
+          <w:t xml:space="preserve">10.1063/1.1703954</w:t>
+        </w:r>
+      </w:hyperlink>
+      <w:r>
+        <w:t xml:space="preserve">.</w:t>
+      </w:r>
+    </w:p>
+    <w:p>
+      <w:pPr>
+        <w:pStyle w:val="Compact"/>
+        <w:numPr>
+          <w:ilvl w:val="0"/>
+          <w:numId w:val="1001"/>
+        </w:numPr>
+      </w:pPr>
+      <w:r>
+        <w:t xml:space="preserve">Geman S, Geman D. Stochastic relaxation, Gibbs distributions, and the Bayesian restoration of images[J]. IEEE Transactions on Pattern Analysis and Machine Intelligence, 1984, PAMI-6(6): 721-741. DOI:</w:t>
+      </w:r>
+      <w:r>
+        <w:t xml:space="preserve"> </w:t>
+      </w:r>
+      <w:hyperlink r:id="rId19">
+        <w:r>
+          <w:rPr>
+            <w:rStyle w:val="Hyperlink"/>
+          </w:rPr>
+          <w:t xml:space="preserve">10.1109/TPAMI.1984.4767596</w:t>
+        </w:r>
+      </w:hyperlink>
+      <w:r>
+        <w:t xml:space="preserve">.</w:t>
+      </w:r>
+    </w:p>
+    <w:p>
+      <w:pPr>
+        <w:pStyle w:val="Compact"/>
+        <w:numPr>
+          <w:ilvl w:val="0"/>
+          <w:numId w:val="1001"/>
+        </w:numPr>
+      </w:pPr>
+      <w:r>
+        <w:t xml:space="preserve">Camsari K Y, Faria R, Sutton B M, et al. Stochastic p-bits for invertible logic[J]. Physical Review X, 2017, 7(3): 031014. DOI:</w:t>
+      </w:r>
+      <w:r>
+        <w:t xml:space="preserve"> </w:t>
+      </w:r>
+      <w:hyperlink r:id="rId20">
+        <w:r>
+          <w:rPr>
+            <w:rStyle w:val="Hyperlink"/>
+          </w:rPr>
+          <w:t xml:space="preserve">10.1103/PhysRevX.7.031014</w:t>
+        </w:r>
+      </w:hyperlink>
+      <w:r>
+        <w:t xml:space="preserve">.</w:t>
+      </w:r>
+    </w:p>
+    <w:p>
+      <w:pPr>
+        <w:pStyle w:val="Compact"/>
+        <w:numPr>
+          <w:ilvl w:val="0"/>
+          <w:numId w:val="1001"/>
+        </w:numPr>
+      </w:pPr>
+      <w:r>
+        <w:t xml:space="preserve">Camsari K Y, Sutton B M, Datta S. p-bits for probabilistic spin logic[J]. Applied Physics Reviews, 2019, 6(1): 011305. DOI:</w:t>
+      </w:r>
+      <w:r>
+        <w:t xml:space="preserve"> </w:t>
+      </w:r>
+      <w:hyperlink r:id="rId21">
+        <w:r>
+          <w:rPr>
+            <w:rStyle w:val="Hyperlink"/>
+          </w:rPr>
+          <w:t xml:space="preserve">10.1063/1.5055860</w:t>
+        </w:r>
+      </w:hyperlink>
+      <w:r>
+        <w:t xml:space="preserve">.</w:t>
+      </w:r>
+    </w:p>
+    <w:p>
+      <w:pPr>
+        <w:pStyle w:val="Compact"/>
+        <w:numPr>
+          <w:ilvl w:val="0"/>
+          <w:numId w:val="1001"/>
+        </w:numPr>
+      </w:pPr>
+      <w:r>
+        <w:t xml:space="preserve">Rønnow T F, Wang Z, Job J, et al. Defining and detecting quantum speedup[J]. Science, 2014, 345(6195): 420-424. DOI:</w:t>
+      </w:r>
+      <w:r>
+        <w:t xml:space="preserve"> </w:t>
+      </w:r>
+      <w:hyperlink r:id="rId22">
+        <w:r>
+          <w:rPr>
+            <w:rStyle w:val="Hyperlink"/>
+          </w:rPr>
+          <w:t xml:space="preserve">10.1126/science.1252319</w:t>
+        </w:r>
+      </w:hyperlink>
+      <w:r>
+        <w:t xml:space="preserve">.</w:t>
+      </w:r>
+    </w:p>
+    <w:p>
+      <w:pPr>
+        <w:pStyle w:val="Compact"/>
+        <w:numPr>
+          <w:ilvl w:val="0"/>
+          <w:numId w:val="1001"/>
+        </w:numPr>
+      </w:pPr>
+      <w:r>
+        <w:t xml:space="preserve">Wilson E B. Probable inference, the law of succession, and statistical inference[J]. Journal of the American Statistical Association, 1927, 22(158): 209-212. DOI:</w:t>
+      </w:r>
+      <w:r>
+        <w:t xml:space="preserve"> </w:t>
+      </w:r>
+      <w:hyperlink r:id="rId23">
+        <w:r>
+          <w:rPr>
+            <w:rStyle w:val="Hyperlink"/>
+          </w:rPr>
+          <w:t xml:space="preserve">10.1080/01621459.1927.10502953</w:t>
+        </w:r>
+      </w:hyperlink>
+      <w:r>
+        <w:t xml:space="preserve">.</w:t>
+      </w:r>
+    </w:p>
+    <w:p>
+      <w:pPr>
+        <w:pStyle w:val="Compact"/>
+        <w:numPr>
+          <w:ilvl w:val="0"/>
+          <w:numId w:val="1001"/>
+        </w:numPr>
+      </w:pPr>
+      <w:r>
+        <w:t xml:space="preserve">Croes G A. A method for solving traveling-salesman problems[J]. Operations Research, 1958, 6(6): 791-812. DOI:</w:t>
+      </w:r>
+      <w:r>
+        <w:t xml:space="preserve"> </w:t>
+      </w:r>
+      <w:hyperlink r:id="rId24">
+        <w:r>
+          <w:rPr>
+            <w:rStyle w:val="Hyperlink"/>
+          </w:rPr>
+          <w:t xml:space="preserve">10.1287/opre.6.6.791</w:t>
+        </w:r>
+      </w:hyperlink>
+      <w:r>
+        <w:t xml:space="preserve">.</w:t>
+      </w:r>
+    </w:p>
+    <w:p>
+      <w:pPr>
+        <w:pStyle w:val="Compact"/>
+        <w:numPr>
+          <w:ilvl w:val="0"/>
+          <w:numId w:val="1001"/>
+        </w:numPr>
+      </w:pPr>
+      <w:r>
+        <w:t xml:space="preserve">Lin S, Kernighan B W. An effective heuristic algorithm for the traveling-salesman problem[J]. Operations Research, 1973, 21(2): 498-516. DOI:</w:t>
+      </w:r>
+      <w:r>
+        <w:t xml:space="preserve"> </w:t>
+      </w:r>
+      <w:hyperlink r:id="rId25">
+        <w:r>
+          <w:rPr>
+            <w:rStyle w:val="Hyperlink"/>
+          </w:rPr>
+          <w:t xml:space="preserve">10.1287/opre.21.2.498</w:t>
+        </w:r>
+      </w:hyperlink>
+      <w:r>
+        <w:t xml:space="preserve">.</w:t>
+      </w:r>
+    </w:p>
+    <w:p>
+      <w:pPr>
+        <w:pStyle w:val="Compact"/>
+        <w:numPr>
+          <w:ilvl w:val="0"/>
+          <w:numId w:val="1001"/>
+        </w:numPr>
+      </w:pPr>
+      <w:r>
+        <w:t xml:space="preserve">Pelgrom M J M, Duinmaijer A C J, Welbers A P G. Matching properties of MOS transistors[J]. IEEE Journal of Solid-State Circuits, 1989, 24(5): 1433-1439. DOI:</w:t>
+      </w:r>
+      <w:r>
+        <w:t xml:space="preserve"> </w:t>
+      </w:r>
+      <w:hyperlink r:id="rId26">
+        <w:r>
+          <w:rPr>
+            <w:rStyle w:val="Hyperlink"/>
+          </w:rPr>
+          <w:t xml:space="preserve">10.1109/JSSC.1989.572629</w:t>
+        </w:r>
+      </w:hyperlink>
+      <w:r>
+        <w:t xml:space="preserve">.</w:t>
+      </w:r>
+    </w:p>
+    <w:p>
+      <w:pPr>
+        <w:pStyle w:val="Compact"/>
+        <w:numPr>
+          <w:ilvl w:val="0"/>
+          <w:numId w:val="1001"/>
+        </w:numPr>
+      </w:pPr>
+      <w:r>
+        <w:t xml:space="preserve">Razavi B. The StrongARM latch [A Circuit for All Seasons][J]. IEEE Solid-State Circuits Magazine, 2015, 7(2): 12-17. DOI:</w:t>
+      </w:r>
+      <w:r>
+        <w:t xml:space="preserve"> </w:t>
+      </w:r>
+      <w:hyperlink r:id="rId27">
+        <w:r>
+          <w:rPr>
+            <w:rStyle w:val="Hyperlink"/>
+          </w:rPr>
+          <w:t xml:space="preserve">10.1109/MSSC.2015.2418155</w:t>
+        </w:r>
+      </w:hyperlink>
+      <w:r>
+        <w:t xml:space="preserve">.</w:t>
+      </w:r>
+    </w:p>
+    <w:p>
+      <w:pPr>
+        <w:pStyle w:val="Compact"/>
+        <w:numPr>
+          <w:ilvl w:val="0"/>
+          <w:numId w:val="1001"/>
+        </w:numPr>
+      </w:pPr>
+      <w:r>
+        <w:t xml:space="preserve">Lucas A. Ising formulations of many NP problems[J]. Frontiers in Physics, 2014, 2: 5. DOI:</w:t>
+      </w:r>
+      <w:r>
+        <w:t xml:space="preserve"> </w:t>
+      </w:r>
+      <w:hyperlink r:id="rId28">
+        <w:r>
+          <w:rPr>
+            <w:rStyle w:val="Hyperlink"/>
+          </w:rPr>
+          <w:t xml:space="preserve">10.3389/fphy.2014.00005</w:t>
+        </w:r>
+      </w:hyperlink>
+      <w:r>
+        <w:t xml:space="preserve">.</w:t>
+      </w:r>
+    </w:p>
+    <w:p>
+      <w:pPr>
+        <w:pStyle w:val="Compact"/>
+        <w:numPr>
+          <w:ilvl w:val="0"/>
+          <w:numId w:val="1001"/>
+        </w:numPr>
+      </w:pPr>
+      <w:r>
+        <w:t xml:space="preserve">Kirkpatrick S, Gelatt C D, Vecchi M P. Optimization by simulated annealing[J]. Science, 1983, 220(4598): 671-680. DOI:</w:t>
+      </w:r>
+      <w:r>
+        <w:t xml:space="preserve"> </w:t>
+      </w:r>
+      <w:hyperlink r:id="rId29">
+        <w:r>
+          <w:rPr>
+            <w:rStyle w:val="Hyperlink"/>
+          </w:rPr>
+          <w:t xml:space="preserve">10.1126/science.220.4598.671</w:t>
+        </w:r>
+      </w:hyperlink>
+      <w:r>
+        <w:t xml:space="preserve">.</w:t>
+      </w:r>
+    </w:p>
+    <w:p>
+      <w:pPr>
+        <w:pStyle w:val="Compact"/>
+        <w:numPr>
+          <w:ilvl w:val="0"/>
+          <w:numId w:val="1001"/>
+        </w:numPr>
+      </w:pPr>
+      <w:r>
+        <w:t xml:space="preserve">Borders W A, Pervaiz A Z, Fukami S, et al. Integer factorization using stochastic magnetic tunnel junctions[J]. Nature, 2019, 573(7774): 390-393. DOI:</w:t>
+      </w:r>
+      <w:r>
+        <w:t xml:space="preserve"> </w:t>
+      </w:r>
+      <w:hyperlink r:id="rId30">
+        <w:r>
+          <w:rPr>
+            <w:rStyle w:val="Hyperlink"/>
+          </w:rPr>
+          <w:t xml:space="preserve">10.1038/s41586-019-1557-9</w:t>
+        </w:r>
+      </w:hyperlink>
+      <w:r>
+        <w:t xml:space="preserve">.</w:t>
+      </w:r>
+    </w:p>
+    <w:p>
+      <w:pPr>
+        <w:pStyle w:val="Compact"/>
+        <w:numPr>
+          <w:ilvl w:val="0"/>
+          <w:numId w:val="1001"/>
+        </w:numPr>
+      </w:pPr>
+      <w:r>
+        <w:t xml:space="preserve">Si J, Yang S, Cen Y, et al. Energy-efficient superparamagnetic Ising machine and its application to traveling salesman problems[J]. Nature Communications, 2024, 15: 3457. DOI:</w:t>
+      </w:r>
+      <w:r>
+        <w:t xml:space="preserve"> </w:t>
+      </w:r>
+      <w:hyperlink r:id="rId31">
+        <w:r>
+          <w:rPr>
+            <w:rStyle w:val="Hyperlink"/>
+          </w:rPr>
+          <w:t xml:space="preserve">10.1038/s41467-024-47818-z</w:t>
+        </w:r>
+      </w:hyperlink>
+      <w:r>
+        <w:t xml:space="preserve">.</w:t>
+      </w:r>
+    </w:p>
+    <w:bookmarkEnd w:id="32"/>
+    <w:bookmarkEnd w:id="33"/>
     <w:sectPr>
       <w:footnotePr>
         <w:numRestart w:val="eachSect"/>
@@ -2215,8 +2629,123 @@
       </w:pPr>
     </w:lvl>
   </w:abstractNum>
+  <w:abstractNum w:abstractNumId="99411">
+    <w:nsid w:val="00A99411"/>
+    <w:multiLevelType w:val="multilevel"/>
+    <w:lvl w:ilvl="0">
+      <w:start w:val="1"/>
+      <w:numFmt w:val="decimal"/>
+      <w:lvlText w:val="%1."/>
+      <w:lvlJc w:val="left"/>
+      <w:pPr>
+        <w:ind w:left="720" w:hanging="360"/>
+      </w:pPr>
+    </w:lvl>
+    <w:lvl w:ilvl="1">
+      <w:start w:val="1"/>
+      <w:numFmt w:val="decimal"/>
+      <w:lvlText w:val="%2."/>
+      <w:lvlJc w:val="left"/>
+      <w:pPr>
+        <w:ind w:left="1440" w:hanging="360"/>
+      </w:pPr>
+    </w:lvl>
+    <w:lvl w:ilvl="2">
+      <w:start w:val="1"/>
+      <w:numFmt w:val="decimal"/>
+      <w:lvlText w:val="%3."/>
+      <w:lvlJc w:val="left"/>
+      <w:pPr>
+        <w:ind w:left="2160" w:hanging="360"/>
+      </w:pPr>
+    </w:lvl>
+    <w:lvl w:ilvl="3">
+      <w:start w:val="1"/>
+      <w:numFmt w:val="decimal"/>
+      <w:lvlText w:val="%4."/>
+      <w:lvlJc w:val="left"/>
+      <w:pPr>
+        <w:ind w:left="2880" w:hanging="360"/>
+      </w:pPr>
+    </w:lvl>
+    <w:lvl w:ilvl="4">
+      <w:start w:val="1"/>
+      <w:numFmt w:val="decimal"/>
+      <w:lvlText w:val="%5."/>
+      <w:lvlJc w:val="left"/>
+      <w:pPr>
+        <w:ind w:left="3600" w:hanging="360"/>
+      </w:pPr>
+    </w:lvl>
+    <w:lvl w:ilvl="5">
+      <w:start w:val="1"/>
+      <w:numFmt w:val="decimal"/>
+      <w:lvlText w:val="%6."/>
+      <w:lvlJc w:val="left"/>
+      <w:pPr>
+        <w:ind w:left="4320" w:hanging="360"/>
+      </w:pPr>
+    </w:lvl>
+    <w:lvl w:ilvl="6">
+      <w:start w:val="1"/>
+      <w:numFmt w:val="decimal"/>
+      <w:lvlText w:val="%7."/>
+      <w:lvlJc w:val="left"/>
+      <w:pPr>
+        <w:ind w:left="5040" w:hanging="360"/>
+      </w:pPr>
+    </w:lvl>
+    <w:lvl w:ilvl="7">
+      <w:start w:val="1"/>
+      <w:numFmt w:val="decimal"/>
+      <w:lvlText w:val="%8."/>
+      <w:lvlJc w:val="left"/>
+      <w:pPr>
+        <w:ind w:left="5760" w:hanging="360"/>
+      </w:pPr>
+    </w:lvl>
+    <w:lvl w:ilvl="8">
+      <w:start w:val="1"/>
+      <w:numFmt w:val="decimal"/>
+      <w:lvlText w:val="%9."/>
+      <w:lvlJc w:val="left"/>
+      <w:pPr>
+        <w:ind w:left="6480" w:hanging="360"/>
+      </w:pPr>
+    </w:lvl>
+  </w:abstractNum>
   <w:num w:numId="1000">
     <w:abstractNumId w:val="990"/>
+  </w:num>
+  <w:num w:numId="1001">
+    <w:abstractNumId w:val="99411"/>
+    <w:lvlOverride w:ilvl="0">
+      <w:startOverride w:val="1"/>
+    </w:lvlOverride>
+    <w:lvlOverride w:ilvl="1">
+      <w:startOverride w:val="1"/>
+    </w:lvlOverride>
+    <w:lvlOverride w:ilvl="2">
+      <w:startOverride w:val="1"/>
+    </w:lvlOverride>
+    <w:lvlOverride w:ilvl="3">
+      <w:startOverride w:val="1"/>
+    </w:lvlOverride>
+    <w:lvlOverride w:ilvl="4">
+      <w:startOverride w:val="1"/>
+    </w:lvlOverride>
+    <w:lvlOverride w:ilvl="5">
+      <w:startOverride w:val="1"/>
+    </w:lvlOverride>
+    <w:lvlOverride w:ilvl="6">
+      <w:startOverride w:val="1"/>
+    </w:lvlOverride>
+    <w:lvlOverride w:ilvl="7">
+      <w:startOverride w:val="1"/>
+    </w:lvlOverride>
+    <w:lvlOverride w:ilvl="8">
+      <w:startOverride w:val="1"/>
+    </w:lvlOverride>
   </w:num>
 </w:numbering>
 </file>

</xml_diff>

<commit_message>
Appendix refs: audit every DOI link, regroup list, add Peskun 1973
Link audit (structural + web): all hyperlink r:id -> rels targets match the DOI
shown in the same entry, all distinct; every DOI resolves to the work as cited
and that work is genuinely the source for the component the letter names it for.
Three list-level fixes:
- ordering claim was false (Si 2024 is first named in the letter's opening, sat
  at #15). List is now grouped explicitly: 1-10 newly added, 11-14 pre-existing,
  15 the comparison object, 16 appendix-only.
- letter's '共新增十条' enumerated eleven works (Camsari 2019 was embedded with a
  parenthetical); it now sits in its own sentence, leaving exactly ten.
- Peskun 1973 is named in appendix section 3 but was unlistable for a reviewer
  reading only the appendix; added as entry 16.
docx rebuilt from the user's hand-formatted base again (no pandoc); validate.py
passes, 50->68 paragraphs.

Co-Authored-By: Claude Fable 5 <noreply@anthropic.com>
</commit_message>
<xml_diff>
--- a/notes/appendix_si2024_comparison.docx
+++ b/notes/appendix_si2024_comparison.docx
@@ -2697,7 +2697,7 @@
         <w:rPr>
           <w:rFonts w:hint="eastAsia"/>
         </w:rPr>
-        <w:t>信中所引文献</w:t>
+        <w:t>信与附录所引文献</w:t>
       </w:r>
     </w:p>
     <w:p>
@@ -2723,7 +2723,7 @@
         <w:rPr>
           <w:rFonts w:hint="eastAsia"/>
         </w:rPr>
-        <w:t>以下为说明信中提及的全部文献，按信中出现顺序，DOI为可点击链接。</w:t>
+        <w:t>以下为说明信与本附录提及的全部文献。第1至10条为信中所列新增引文，第11至14条为信中提及的原有引文，第15条为本附录的对比对象，第16条为本附录第3节提及的Peskun排序的出处。</w:t>
       </w:r>
     </w:p>
     <w:p>
@@ -2882,14 +2882,14 @@
         <w:jc w:val="left"/>
       </w:pPr>
       <w:r>
-        <w:t xml:space="preserve">5. Camsari K Y, Sutton B M, Datta S. p-bits for probabilistic spin logic[J]. Applied Physics Reviews, 2019, 6(1): 011305. DOI: </w:t>
+        <w:t xml:space="preserve">5. Rønnow T F, Wang Z, Job J, et al. Defining and detecting quantum speedup[J]. Science, 2014, 345(6195): 420-424. DOI: </w:t>
       </w:r>
       <w:hyperlink r:id="rId105">
         <w:r>
           <w:rPr>
             <w:rStyle w:val="40"/>
           </w:rPr>
-          <w:t>10.1063/1.5055860</w:t>
+          <w:t>10.1126/science.1252319</w:t>
         </w:r>
       </w:hyperlink>
       <w:r>
@@ -2916,14 +2916,14 @@
         <w:jc w:val="left"/>
       </w:pPr>
       <w:r>
-        <w:t xml:space="preserve">6. Rønnow T F, Wang Z, Job J, et al. Defining and detecting quantum speedup[J]. Science, 2014, 345(6195): 420-424. DOI: </w:t>
+        <w:t xml:space="preserve">6. Wilson E B. Probable inference, the law of succession, and statistical inference[J]. Journal of the American Statistical Association, 1927, 22(158): 209-212. DOI: </w:t>
       </w:r>
       <w:hyperlink r:id="rId106">
         <w:r>
           <w:rPr>
             <w:rStyle w:val="40"/>
           </w:rPr>
-          <w:t>10.1126/science.1252319</w:t>
+          <w:t>10.1080/01621459.1927.10502953</w:t>
         </w:r>
       </w:hyperlink>
       <w:r>
@@ -2950,14 +2950,14 @@
         <w:jc w:val="left"/>
       </w:pPr>
       <w:r>
-        <w:t xml:space="preserve">7. Wilson E B. Probable inference, the law of succession, and statistical inference[J]. Journal of the American Statistical Association, 1927, 22(158): 209-212. DOI: </w:t>
+        <w:t xml:space="preserve">7. Croes G A. A method for solving traveling-salesman problems[J]. Operations Research, 1958, 6(6): 791-812. DOI: </w:t>
       </w:r>
       <w:hyperlink r:id="rId107">
         <w:r>
           <w:rPr>
             <w:rStyle w:val="40"/>
           </w:rPr>
-          <w:t>10.1080/01621459.1927.10502953</w:t>
+          <w:t>10.1287/opre.6.6.791</w:t>
         </w:r>
       </w:hyperlink>
       <w:r>
@@ -2984,14 +2984,14 @@
         <w:jc w:val="left"/>
       </w:pPr>
       <w:r>
-        <w:t xml:space="preserve">8. Croes G A. A method for solving traveling-salesman problems[J]. Operations Research, 1958, 6(6): 791-812. DOI: </w:t>
+        <w:t xml:space="preserve">8. Lin S, Kernighan B W. An effective heuristic algorithm for the traveling-salesman problem[J]. Operations Research, 1973, 21(2): 498-516. DOI: </w:t>
       </w:r>
       <w:hyperlink r:id="rId108">
         <w:r>
           <w:rPr>
             <w:rStyle w:val="40"/>
           </w:rPr>
-          <w:t>10.1287/opre.6.6.791</w:t>
+          <w:t>10.1287/opre.21.2.498</w:t>
         </w:r>
       </w:hyperlink>
       <w:r>
@@ -3018,14 +3018,14 @@
         <w:jc w:val="left"/>
       </w:pPr>
       <w:r>
-        <w:t xml:space="preserve">9. Lin S, Kernighan B W. An effective heuristic algorithm for the traveling-salesman problem[J]. Operations Research, 1973, 21(2): 498-516. DOI: </w:t>
+        <w:t xml:space="preserve">9. Pelgrom M J M, Duinmaijer A C J, Welbers A P G. Matching properties of MOS transistors[J]. IEEE Journal of Solid-State Circuits, 1989, 24(5): 1433-1439. DOI: </w:t>
       </w:r>
       <w:hyperlink r:id="rId109">
         <w:r>
           <w:rPr>
             <w:rStyle w:val="40"/>
           </w:rPr>
-          <w:t>10.1287/opre.21.2.498</w:t>
+          <w:t>10.1109/JSSC.1989.572629</w:t>
         </w:r>
       </w:hyperlink>
       <w:r>
@@ -3052,14 +3052,14 @@
         <w:jc w:val="left"/>
       </w:pPr>
       <w:r>
-        <w:t xml:space="preserve">10. Pelgrom M J M, Duinmaijer A C J, Welbers A P G. Matching properties of MOS transistors[J]. IEEE Journal of Solid-State Circuits, 1989, 24(5): 1433-1439. DOI: </w:t>
+        <w:t xml:space="preserve">10. Razavi B. The StrongARM latch [A Circuit for All Seasons][J]. IEEE Solid-State Circuits Magazine, 2015, 7(2): 12-17. DOI: </w:t>
       </w:r>
       <w:hyperlink r:id="rId110">
         <w:r>
           <w:rPr>
             <w:rStyle w:val="40"/>
           </w:rPr>
-          <w:t>10.1109/JSSC.1989.572629</w:t>
+          <w:t>10.1109/MSSC.2015.2418155</w:t>
         </w:r>
       </w:hyperlink>
       <w:r>
@@ -3086,14 +3086,14 @@
         <w:jc w:val="left"/>
       </w:pPr>
       <w:r>
-        <w:t xml:space="preserve">11. Razavi B. The StrongARM latch [A Circuit for All Seasons][J]. IEEE Solid-State Circuits Magazine, 2015, 7(2): 12-17. DOI: </w:t>
+        <w:t xml:space="preserve">11. Camsari K Y, Sutton B M, Datta S. p-bits for probabilistic spin logic[J]. Applied Physics Reviews, 2019, 6(1): 011305. DOI: </w:t>
       </w:r>
       <w:hyperlink r:id="rId111">
         <w:r>
           <w:rPr>
             <w:rStyle w:val="40"/>
           </w:rPr>
-          <w:t>10.1109/MSSC.2015.2418155</w:t>
+          <w:t>10.1063/1.5055860</w:t>
         </w:r>
       </w:hyperlink>
       <w:r>
@@ -3230,6 +3230,40 @@
             <w:rStyle w:val="40"/>
           </w:rPr>
           <w:t>10.1038/s41467-024-47818-z</w:t>
+        </w:r>
+      </w:hyperlink>
+      <w:r>
+        <w:t>.</w:t>
+      </w:r>
+    </w:p>
+    <w:p>
+      <w:pPr>
+        <w:pStyle w:val="45"/>
+        <w:keepNext w:val="0"/>
+        <w:keepLines w:val="0"/>
+        <w:pageBreakBefore w:val="0"/>
+        <w:widowControl/>
+        <w:kinsoku/>
+        <w:wordWrap/>
+        <w:overflowPunct/>
+        <w:topLinePunct w:val="0"/>
+        <w:autoSpaceDE/>
+        <w:autoSpaceDN/>
+        <w:bidi w:val="0"/>
+        <w:snapToGrid/>
+        <w:spacing w:line="240" w:lineRule="auto"/>
+        <w:ind w:leftChars="200" w:left="420" w:hangingChars="200" w:hanging="420"/>
+        <w:jc w:val="left"/>
+      </w:pPr>
+      <w:r>
+        <w:t xml:space="preserve">16. Peskun P H. Optimum Monte-Carlo sampling using Markov chains[J]. Biometrika, 1973, 60(3): 607-612. DOI: </w:t>
+      </w:r>
+      <w:hyperlink r:id="rId116">
+        <w:r>
+          <w:rPr>
+            <w:rStyle w:val="40"/>
+          </w:rPr>
+          <w:t>10.1093/biomet/60.3.607</w:t>
         </w:r>
       </w:hyperlink>
       <w:r>

</xml_diff>